<commit_message>
Fix Vercel serverless DB storage
</commit_message>
<xml_diff>
--- a/500CC_Fitness_Club_Technical_Documentation.docx
+++ b/500CC_Fitness_Club_Technical_Documentation.docx
@@ -42,7 +42,7 @@
           <w:sz w:val="18"/>
           <w:szCs w:val="18"/>
         </w:rPr>
-        <w:t xml:space="preserve">Version 1.0.0  |  Last Auto-Updated: September 2, 2026</w:t>
+        <w:t xml:space="preserve">Version 1.0.0  |  Last Auto-Updated: September 3, 2026</w:t>
       </w:r>
     </w:p>
     <w:p>
@@ -78,7 +78,7 @@
           <w:sz w:val="22"/>
           <w:szCs w:val="22"/>
         </w:rPr>
-        <w:t xml:space="preserve"> Registered Members: 2  |  Active Subscriptions: 1  |  Recorded Invoices: 1</w:t>
+        <w:t xml:space="preserve"> Registered Members: 3  |  Active Subscriptions: 2  |  Recorded Invoices: 1</w:t>
       </w:r>
     </w:p>
     <w:p>

</xml_diff>